<commit_message>
updated the home page
</commit_message>
<xml_diff>
--- a/build/templates/permission-letter.docx
+++ b/build/templates/permission-letter.docx
@@ -10,300 +10,369 @@
         <w:rPr>
           <w:rtl w:val="0"/>
         </w:rPr>
-      </w:r>
-    </w:p>
-    <w:p>
-      <w:pPr>
-        <w:rPr/>
-      </w:pPr>
-      <w:r>
-        <w:rPr>
-          <w:rtl w:val="0"/>
-        </w:rPr>
-      </w:r>
-    </w:p>
-    <w:p>
-      <w:pPr>
-        <w:rPr/>
-      </w:pPr>
-      <w:r>
-        <w:rPr>
-          <w:rtl w:val="0"/>
-        </w:rPr>
-      </w:r>
-    </w:p>
-    <w:p>
-      <w:pPr>
-        <w:rPr/>
-      </w:pPr>
-      <w:r>
-        <w:rPr>
-          <w:rtl w:val="0"/>
-        </w:rPr>
-        <w:t xml:space="preserve">{{date_today}}, {{visitor_affiliation}}, {{purpose}}, {{date_requested}}, {{time_requested}}, {{visitor_name}} </w:t>
+        <w:t xml:space="preserve">Date: {{date_today}}</w:t>
+      </w:r>
+    </w:p>
+    <w:p>
+      <w:pPr>
+        <w:rPr/>
+      </w:pPr>
+      <w:r>
+        <w:rPr>
+          <w:rtl w:val="0"/>
+        </w:rPr>
+      </w:r>
+    </w:p>
+    <w:p>
+      <w:pPr>
+        <w:rPr/>
+      </w:pPr>
+      <w:r>
+        <w:rPr>
+          <w:rtl w:val="0"/>
+        </w:rPr>
+        <w:t xml:space="preserve">TO WHOM IT MAY CONCERN:</w:t>
+      </w:r>
+    </w:p>
+    <w:p>
+      <w:pPr>
+        <w:rPr/>
+      </w:pPr>
+      <w:r>
+        <w:rPr>
+          <w:rtl w:val="0"/>
+        </w:rPr>
+      </w:r>
+    </w:p>
+    <w:p>
+      <w:pPr>
+        <w:rPr/>
+      </w:pPr>
+      <w:r>
+        <w:rPr>
+          <w:rtl w:val="0"/>
+        </w:rPr>
+        <w:t xml:space="preserve">This letter serves as permission for the following visitor to tour Casa Hacienda de Tejeros:</w:t>
+      </w:r>
+    </w:p>
+    <w:p>
+      <w:pPr>
+        <w:rPr/>
+      </w:pPr>
+      <w:r>
+        <w:rPr>
+          <w:rtl w:val="0"/>
+        </w:rPr>
+      </w:r>
+    </w:p>
+    <w:p>
+      <w:pPr>
+        <w:rPr/>
+      </w:pPr>
+      <w:r>
+        <w:rPr>
+          <w:rtl w:val="0"/>
+        </w:rPr>
+        <w:t xml:space="preserve">Visitor Information:</w:t>
+      </w:r>
+    </w:p>
+    <w:p>
+      <w:pPr>
+        <w:rPr/>
+      </w:pPr>
+      <w:r>
+        <w:rPr>
+          <w:rtl w:val="0"/>
+        </w:rPr>
+        <w:t xml:space="preserve">- Name: {{visitor_name}}</w:t>
+      </w:r>
+    </w:p>
+    <w:p>
+      <w:pPr>
+        <w:rPr/>
+      </w:pPr>
+      <w:r>
+        <w:rPr>
+          <w:rtl w:val="0"/>
+        </w:rPr>
+        <w:t xml:space="preserve">- Affiliation: {{visitor_affiliation}}</w:t>
+      </w:r>
+    </w:p>
+    <w:p>
+      <w:pPr>
+        <w:rPr/>
+      </w:pPr>
+      <w:r>
+        <w:rPr>
+          <w:rtl w:val="0"/>
+        </w:rPr>
+        <w:t xml:space="preserve">- Email: {{email}}</w:t>
+      </w:r>
+    </w:p>
+    <w:p>
+      <w:pPr>
+        <w:rPr/>
+      </w:pPr>
+      <w:r>
+        <w:rPr>
+          <w:rtl w:val="0"/>
+        </w:rPr>
+        <w:t xml:space="preserve">- Phone: {{phone}}</w:t>
+      </w:r>
+    </w:p>
+    <w:p>
+      <w:pPr>
+        <w:rPr/>
+      </w:pPr>
+      <w:r>
+        <w:rPr>
+          <w:rtl w:val="0"/>
+        </w:rPr>
+      </w:r>
+    </w:p>
+    <w:p>
+      <w:pPr>
+        <w:rPr/>
+      </w:pPr>
+      <w:r>
+        <w:rPr>
+          <w:rtl w:val="0"/>
+        </w:rPr>
+        <w:t xml:space="preserve">Organization Details:</w:t>
+      </w:r>
+    </w:p>
+    <w:p>
+      <w:pPr>
+        <w:rPr/>
+      </w:pPr>
+      <w:r>
+        <w:rPr>
+          <w:rtl w:val="0"/>
+        </w:rPr>
+        <w:t xml:space="preserve">- Organization Type: {{organization_type}}</w:t>
+      </w:r>
+    </w:p>
+    <w:p>
+      <w:pPr>
+        <w:rPr/>
+      </w:pPr>
+      <w:r>
+        <w:rPr>
+          <w:rtl w:val="0"/>
+        </w:rPr>
+        <w:t xml:space="preserve">- School Name: {{school_name}}</w:t>
+      </w:r>
+    </w:p>
+    <w:p>
+      <w:pPr>
+        <w:rPr/>
+      </w:pPr>
+      <w:r>
+        <w:rPr>
+          <w:rtl w:val="0"/>
+        </w:rPr>
+        <w:t xml:space="preserve">- Course: {{course}}</w:t>
+      </w:r>
+    </w:p>
+    <w:p>
+      <w:pPr>
+        <w:rPr/>
+      </w:pPr>
+      <w:r>
+        <w:rPr>
+          <w:rtl w:val="0"/>
+        </w:rPr>
+        <w:t xml:space="preserve">- Organization Name: {{organization_name}}</w:t>
+      </w:r>
+    </w:p>
+    <w:p>
+      <w:pPr>
+        <w:rPr/>
+      </w:pPr>
+      <w:r>
+        <w:rPr>
+          <w:rtl w:val="0"/>
+        </w:rPr>
+      </w:r>
+    </w:p>
+    <w:p>
+      <w:pPr>
+        <w:rPr/>
+      </w:pPr>
+      <w:r>
+        <w:rPr>
+          <w:rtl w:val="0"/>
+        </w:rPr>
+        <w:t xml:space="preserve">Tour Details:</w:t>
+      </w:r>
+    </w:p>
+    <w:p>
+      <w:pPr>
+        <w:rPr/>
+      </w:pPr>
+      <w:r>
+        <w:rPr>
+          <w:rtl w:val="0"/>
+        </w:rPr>
+        <w:t xml:space="preserve">- Purpose: {{purpose}}</w:t>
+      </w:r>
+    </w:p>
+    <w:p>
+      <w:pPr>
+        <w:rPr/>
+      </w:pPr>
+      <w:r>
+        <w:rPr>
+          <w:rtl w:val="0"/>
+        </w:rPr>
+        <w:t xml:space="preserve">- Requested Date: {{date_requested}}</w:t>
+      </w:r>
+    </w:p>
+    <w:p>
+      <w:pPr>
+        <w:rPr/>
+      </w:pPr>
+      <w:r>
+        <w:rPr>
+          <w:rtl w:val="0"/>
+        </w:rPr>
+        <w:t xml:space="preserve">- Requested Time: {{time_requested}}</w:t>
+      </w:r>
+    </w:p>
+    <w:p>
+      <w:pPr>
+        <w:rPr/>
+      </w:pPr>
+      <w:r>
+        <w:rPr>
+          <w:rtl w:val="0"/>
+        </w:rPr>
+        <w:t xml:space="preserve">- Number of Guests: {{guests}}</w:t>
+      </w:r>
+    </w:p>
+    <w:p>
+      <w:pPr>
+        <w:rPr/>
+      </w:pPr>
+      <w:r>
+        <w:rPr>
+          <w:rtl w:val="0"/>
+        </w:rPr>
+        <w:t xml:space="preserve">- Package: {{package_name}}</w:t>
+      </w:r>
+    </w:p>
+    <w:p>
+      <w:pPr>
+        <w:rPr/>
+      </w:pPr>
+      <w:r>
+        <w:rPr>
+          <w:rtl w:val="0"/>
+        </w:rPr>
+      </w:r>
+    </w:p>
+    <w:p>
+      <w:pPr>
+        <w:rPr/>
+      </w:pPr>
+      <w:r>
+        <w:rPr>
+          <w:rtl w:val="0"/>
+        </w:rPr>
+        <w:t xml:space="preserve">This permission letter must be presented upon arrival at Casa Hacienda de Tejeros for verification.</w:t>
+      </w:r>
+    </w:p>
+    <w:p>
+      <w:pPr>
+        <w:rPr/>
+      </w:pPr>
+      <w:r>
+        <w:rPr>
+          <w:rtl w:val="0"/>
+        </w:rPr>
+      </w:r>
+    </w:p>
+    <w:p>
+      <w:pPr>
+        <w:rPr/>
+      </w:pPr>
+      <w:r>
+        <w:rPr>
+          <w:rtl w:val="0"/>
+        </w:rPr>
+        <w:t xml:space="preserve">Thank you for choosing to visit our historical site.</w:t>
+      </w:r>
+    </w:p>
+    <w:p>
+      <w:pPr>
+        <w:rPr/>
+      </w:pPr>
+      <w:r>
+        <w:rPr>
+          <w:rtl w:val="0"/>
+        </w:rPr>
+      </w:r>
+    </w:p>
+    <w:p>
+      <w:pPr>
+        <w:rPr/>
+      </w:pPr>
+      <w:r>
+        <w:rPr>
+          <w:rtl w:val="0"/>
+        </w:rPr>
+        <w:t xml:space="preserve">Sincerely,</w:t>
+      </w:r>
+    </w:p>
+    <w:p>
+      <w:pPr>
+        <w:rPr/>
+      </w:pPr>
+      <w:r>
+        <w:rPr>
+          <w:rtl w:val="0"/>
+        </w:rPr>
+        <w:t xml:space="preserve">Casa Hacienda de Tejeros Tourism Office</w:t>
+      </w:r>
+    </w:p>
+    <w:p>
+      <w:pPr>
+        <w:rPr/>
+      </w:pPr>
+      <w:r>
+        <w:rPr>
+          <w:rtl w:val="0"/>
+        </w:rPr>
+        <w:t xml:space="preserve">Rosario, Cavite</w:t>
+      </w:r>
+    </w:p>
+    <w:p>
+      <w:pPr>
+        <w:rPr/>
+      </w:pPr>
+      <w:r>
+        <w:rPr>
+          <w:rtl w:val="0"/>
+        </w:rPr>
+      </w:r>
+    </w:p>
+    <w:p>
+      <w:pPr>
+        <w:rPr/>
+      </w:pPr>
+      <w:r>
+        <w:rPr>
+          <w:rtl w:val="0"/>
+        </w:rPr>
       </w:r>
     </w:p>
     <w:sectPr>
-      <w:headerReference r:id="rId6" w:type="default"/>
       <w:pgSz w:h="15840" w:w="12240" w:orient="portrait"/>
-      <w:pgMar w:bottom="1440" w:top="1440" w:left="1440" w:right="1440" w:header="708" w:footer="708"/>
+      <w:pgMar w:bottom="1440" w:top="1440" w:left="1440" w:right="1440" w:header="720" w:footer="720"/>
       <w:pgNumType w:start="1"/>
     </w:sectPr>
   </w:body>
 </w:document>
-</file>
-
-<file path=word/header1.xml><?xml version="1.0" encoding="utf-8"?>
-<w:hdr xmlns:mc="http://schemas.openxmlformats.org/markup-compatibility/2006" xmlns:o="urn:schemas-microsoft-com:office:office" xmlns:r="http://schemas.openxmlformats.org/officeDocument/2006/relationships" xmlns:m="http://schemas.openxmlformats.org/officeDocument/2006/math" xmlns:v="urn:schemas-microsoft-com:vml" xmlns:wp="http://schemas.openxmlformats.org/drawingml/2006/wordprocessingDrawing" xmlns:w10="urn:schemas-microsoft-com:office:word" xmlns:w="http://schemas.openxmlformats.org/wordprocessingml/2006/main" xmlns:wne="http://schemas.microsoft.com/office/word/2006/wordml" xmlns:sl="http://schemas.openxmlformats.org/schemaLibrary/2006/main" xmlns:a="http://schemas.openxmlformats.org/drawingml/2006/main" xmlns:pic="http://schemas.openxmlformats.org/drawingml/2006/picture" xmlns:c="http://schemas.openxmlformats.org/drawingml/2006/chart" xmlns:lc="http://schemas.openxmlformats.org/drawingml/2006/lockedCanvas" xmlns:dgm="http://schemas.openxmlformats.org/drawingml/2006/diagram" xmlns:wps="http://schemas.microsoft.com/office/word/2010/wordprocessingShape" xmlns:wpg="http://schemas.microsoft.com/office/word/2010/wordprocessingGroup" xmlns:w14="http://schemas.microsoft.com/office/word/2010/wordml" xmlns:w15="http://schemas.microsoft.com/office/word/2012/wordml" xmlns:w16="http://schemas.microsoft.com/office/word/2018/wordml" xmlns:w16cex="http://schemas.microsoft.com/office/word/2018/wordml/cex" xmlns:w16cid="http://schemas.microsoft.com/office/word/2016/wordml/cid" xmlns="http://schemas.microsoft.com/office/tasks/2019/documenttasks" xmlns:cr="http://schemas.microsoft.com/office/comments/2020/reactions">
-  <w:p>
-    <w:pPr>
-      <w:keepNext w:val="0"/>
-      <w:keepLines w:val="0"/>
-      <w:pageBreakBefore w:val="0"/>
-      <w:widowControl w:val="1"/>
-      <w:pBdr>
-        <w:top w:space="0" w:sz="0" w:val="nil"/>
-        <w:left w:space="0" w:sz="0" w:val="nil"/>
-        <w:bottom w:space="0" w:sz="0" w:val="nil"/>
-        <w:right w:space="0" w:sz="0" w:val="nil"/>
-        <w:between w:space="0" w:sz="0" w:val="nil"/>
-      </w:pBdr>
-      <w:shd w:fill="auto" w:val="clear"/>
-      <w:tabs>
-        <w:tab w:val="center" w:leader="none" w:pos="4680"/>
-        <w:tab w:val="right" w:leader="none" w:pos="9360"/>
-      </w:tabs>
-      <w:spacing w:after="0" w:before="0" w:line="240" w:lineRule="auto"/>
-      <w:ind w:left="0" w:right="0" w:firstLine="0"/>
-      <w:jc w:val="center"/>
-      <w:rPr>
-        <w:rFonts w:ascii="Times New Roman" w:cs="Times New Roman" w:eastAsia="Times New Roman" w:hAnsi="Times New Roman"/>
-        <w:b w:val="1"/>
-        <w:i w:val="0"/>
-        <w:smallCaps w:val="0"/>
-        <w:strike w:val="0"/>
-        <w:color w:val="000000"/>
-        <w:sz w:val="28"/>
-        <w:szCs w:val="28"/>
-        <w:u w:val="none"/>
-        <w:shd w:fill="auto" w:val="clear"/>
-        <w:vertAlign w:val="baseline"/>
-      </w:rPr>
-    </w:pPr>
-    <w:r>
-      <w:rPr>
-        <w:rFonts w:ascii="Times New Roman" w:cs="Times New Roman" w:eastAsia="Times New Roman" w:hAnsi="Times New Roman"/>
-        <w:b w:val="1"/>
-        <w:i w:val="0"/>
-        <w:smallCaps w:val="0"/>
-        <w:strike w:val="0"/>
-        <w:color w:val="000000"/>
-        <w:sz w:val="28"/>
-        <w:szCs w:val="28"/>
-        <w:u w:val="none"/>
-        <w:shd w:fill="auto" w:val="clear"/>
-        <w:vertAlign w:val="baseline"/>
-        <w:rtl w:val="0"/>
-      </w:rPr>
-      <w:t xml:space="preserve">Province of Cavite</w:t>
-    </w:r>
-    <w:r>
-      <w:drawing>
-        <wp:anchor allowOverlap="1" behindDoc="0" distB="0" distT="0" distL="114300" distR="114300" hidden="0" layoutInCell="1" locked="0" relativeHeight="0" simplePos="0">
-          <wp:simplePos x="0" y="0"/>
-          <wp:positionH relativeFrom="column">
-            <wp:posOffset>5081270</wp:posOffset>
-          </wp:positionH>
-          <wp:positionV relativeFrom="paragraph">
-            <wp:posOffset>-429258</wp:posOffset>
-          </wp:positionV>
-          <wp:extent cx="1394460" cy="1493520"/>
-          <wp:effectExtent b="0" l="0" r="0" t="0"/>
-          <wp:wrapNone/>
-          <wp:docPr descr="A logo of a company&#10;&#10;Description automatically generated" id="1" name="image1.png"/>
-          <a:graphic>
-            <a:graphicData uri="http://schemas.openxmlformats.org/drawingml/2006/picture">
-              <pic:pic>
-                <pic:nvPicPr>
-                  <pic:cNvPr descr="A logo of a company&#10;&#10;Description automatically generated" id="0" name="image1.png"/>
-                  <pic:cNvPicPr preferRelativeResize="0"/>
-                </pic:nvPicPr>
-                <pic:blipFill>
-                  <a:blip r:embed="rId1"/>
-                  <a:srcRect b="0" l="0" r="0" t="0"/>
-                  <a:stretch>
-                    <a:fillRect/>
-                  </a:stretch>
-                </pic:blipFill>
-                <pic:spPr>
-                  <a:xfrm>
-                    <a:off x="0" y="0"/>
-                    <a:ext cx="1394460" cy="1493520"/>
-                  </a:xfrm>
-                  <a:prstGeom prst="rect"/>
-                  <a:ln/>
-                </pic:spPr>
-              </pic:pic>
-            </a:graphicData>
-          </a:graphic>
-        </wp:anchor>
-      </w:drawing>
-    </w:r>
-    <w:r>
-      <w:drawing>
-        <wp:anchor allowOverlap="1" behindDoc="0" distB="0" distT="0" distL="114300" distR="114300" hidden="0" layoutInCell="1" locked="0" relativeHeight="0" simplePos="0">
-          <wp:simplePos x="0" y="0"/>
-          <wp:positionH relativeFrom="column">
-            <wp:posOffset>-308608</wp:posOffset>
-          </wp:positionH>
-          <wp:positionV relativeFrom="paragraph">
-            <wp:posOffset>-253364</wp:posOffset>
-          </wp:positionV>
-          <wp:extent cx="1127760" cy="1127760"/>
-          <wp:effectExtent b="0" l="0" r="0" t="0"/>
-          <wp:wrapNone/>
-          <wp:docPr descr="A circular logo with different images&#10;&#10;Description automatically generated with medium confidence" id="2" name="image2.png"/>
-          <a:graphic>
-            <a:graphicData uri="http://schemas.openxmlformats.org/drawingml/2006/picture">
-              <pic:pic>
-                <pic:nvPicPr>
-                  <pic:cNvPr descr="A circular logo with different images&#10;&#10;Description automatically generated with medium confidence" id="0" name="image2.png"/>
-                  <pic:cNvPicPr preferRelativeResize="0"/>
-                </pic:nvPicPr>
-                <pic:blipFill>
-                  <a:blip r:embed="rId2"/>
-                  <a:srcRect b="0" l="0" r="0" t="0"/>
-                  <a:stretch>
-                    <a:fillRect/>
-                  </a:stretch>
-                </pic:blipFill>
-                <pic:spPr>
-                  <a:xfrm>
-                    <a:off x="0" y="0"/>
-                    <a:ext cx="1127760" cy="1127760"/>
-                  </a:xfrm>
-                  <a:prstGeom prst="rect"/>
-                  <a:ln/>
-                </pic:spPr>
-              </pic:pic>
-            </a:graphicData>
-          </a:graphic>
-        </wp:anchor>
-      </w:drawing>
-    </w:r>
-  </w:p>
-  <w:p>
-    <w:pPr>
-      <w:keepNext w:val="0"/>
-      <w:keepLines w:val="0"/>
-      <w:pageBreakBefore w:val="0"/>
-      <w:widowControl w:val="1"/>
-      <w:pBdr>
-        <w:top w:space="0" w:sz="0" w:val="nil"/>
-        <w:left w:space="0" w:sz="0" w:val="nil"/>
-        <w:bottom w:space="0" w:sz="0" w:val="nil"/>
-        <w:right w:space="0" w:sz="0" w:val="nil"/>
-        <w:between w:space="0" w:sz="0" w:val="nil"/>
-      </w:pBdr>
-      <w:shd w:fill="auto" w:val="clear"/>
-      <w:tabs>
-        <w:tab w:val="center" w:leader="none" w:pos="4680"/>
-        <w:tab w:val="right" w:leader="none" w:pos="9360"/>
-      </w:tabs>
-      <w:spacing w:after="0" w:before="0" w:line="360" w:lineRule="auto"/>
-      <w:ind w:left="0" w:right="0" w:firstLine="0"/>
-      <w:jc w:val="center"/>
-      <w:rPr>
-        <w:rFonts w:ascii="Times New Roman" w:cs="Times New Roman" w:eastAsia="Times New Roman" w:hAnsi="Times New Roman"/>
-        <w:b w:val="1"/>
-        <w:i w:val="0"/>
-        <w:smallCaps w:val="0"/>
-        <w:strike w:val="0"/>
-        <w:color w:val="000000"/>
-        <w:sz w:val="28"/>
-        <w:szCs w:val="28"/>
-        <w:u w:val="none"/>
-        <w:shd w:fill="auto" w:val="clear"/>
-        <w:vertAlign w:val="baseline"/>
-      </w:rPr>
-    </w:pPr>
-    <w:r>
-      <w:rPr>
-        <w:rFonts w:ascii="Times New Roman" w:cs="Times New Roman" w:eastAsia="Times New Roman" w:hAnsi="Times New Roman"/>
-        <w:b w:val="1"/>
-        <w:i w:val="0"/>
-        <w:smallCaps w:val="0"/>
-        <w:strike w:val="0"/>
-        <w:color w:val="000000"/>
-        <w:sz w:val="28"/>
-        <w:szCs w:val="28"/>
-        <w:u w:val="none"/>
-        <w:shd w:fill="auto" w:val="clear"/>
-        <w:vertAlign w:val="baseline"/>
-        <w:rtl w:val="0"/>
-      </w:rPr>
-      <w:t xml:space="preserve">MUNICIPALITY OF ROSARIO</w:t>
-    </w:r>
-  </w:p>
-  <w:p>
-    <w:pPr>
-      <w:keepNext w:val="0"/>
-      <w:keepLines w:val="0"/>
-      <w:pageBreakBefore w:val="0"/>
-      <w:widowControl w:val="1"/>
-      <w:pBdr>
-        <w:top w:space="0" w:sz="0" w:val="nil"/>
-        <w:left w:space="0" w:sz="0" w:val="nil"/>
-        <w:bottom w:space="0" w:sz="0" w:val="nil"/>
-        <w:right w:space="0" w:sz="0" w:val="nil"/>
-        <w:between w:space="0" w:sz="0" w:val="nil"/>
-      </w:pBdr>
-      <w:shd w:fill="auto" w:val="clear"/>
-      <w:tabs>
-        <w:tab w:val="center" w:leader="none" w:pos="4680"/>
-        <w:tab w:val="right" w:leader="none" w:pos="9360"/>
-      </w:tabs>
-      <w:spacing w:after="0" w:before="0" w:line="360" w:lineRule="auto"/>
-      <w:ind w:left="0" w:right="0" w:firstLine="0"/>
-      <w:jc w:val="center"/>
-      <w:rPr>
-        <w:rFonts w:ascii="Aptos" w:cs="Aptos" w:eastAsia="Aptos" w:hAnsi="Aptos"/>
-        <w:b w:val="0"/>
-        <w:i w:val="0"/>
-        <w:smallCaps w:val="0"/>
-        <w:strike w:val="0"/>
-        <w:color w:val="000000"/>
-        <w:sz w:val="24"/>
-        <w:szCs w:val="24"/>
-        <w:u w:val="none"/>
-        <w:shd w:fill="auto" w:val="clear"/>
-        <w:vertAlign w:val="baseline"/>
-      </w:rPr>
-    </w:pPr>
-    <w:r>
-      <w:rPr>
-        <w:rFonts w:ascii="Times New Roman" w:cs="Times New Roman" w:eastAsia="Times New Roman" w:hAnsi="Times New Roman"/>
-        <w:b w:val="1"/>
-        <w:i w:val="0"/>
-        <w:smallCaps w:val="0"/>
-        <w:strike w:val="0"/>
-        <w:color w:val="000000"/>
-        <w:sz w:val="28"/>
-        <w:szCs w:val="28"/>
-        <w:u w:val="none"/>
-        <w:shd w:fill="auto" w:val="clear"/>
-        <w:vertAlign w:val="baseline"/>
-        <w:rtl w:val="0"/>
-      </w:rPr>
-      <w:t xml:space="preserve">OFFICE OF THE MUNICIPAL TOURISM</w:t>
-    </w:r>
-    <w:r>
-      <w:rPr>
-        <w:rtl w:val="0"/>
-      </w:rPr>
-    </w:r>
-  </w:p>
-</w:hdr>
 </file>
 
 <file path=word/numbering.xml><?xml version="1.0" encoding="utf-8"?>

</xml_diff>